<commit_message>
feat(docs/tuan_2): thêm quy trình và quy định khám chẩn đoán điều trị
</commit_message>
<xml_diff>
--- a/docs/tuan_2/draft/do_quoc_thinh/Quy_trinh_nghiep_vu_kham_chan_doan_dieu_tri.docx
+++ b/docs/tuan_2/draft/do_quoc_thinh/Quy_trinh_nghiep_vu_kham_chan_doan_dieu_tri.docx
@@ -1189,21 +1189,197 @@
       </w:r>
     </w:p>
     <w:p>
-      <w:pPr>
-        <w:rPr>
-          <w:lang w:val="en-US"/>
-        </w:rPr>
-      </w:pPr>
-      <w:r>
-        <w:rPr>
-          <w:lang w:val="en-US"/>
-        </w:rPr>
+      <w:r>
         <w:t xml:space="preserve">B1: </w:t>
       </w:r>
       <w:r>
         <w:t>Sau mỗi lần điều trị, hồ sơ được cập nhật</w:t>
       </w:r>
       <w:r>
+        <w:t xml:space="preserve"> các thông tin như ( </w:t>
+      </w:r>
+      <w:r>
+        <w:t>Ngày điều trị</w:t>
+      </w:r>
+      <w:r>
+        <w:t>, b</w:t>
+      </w:r>
+      <w:r>
+        <w:t>ác sĩ thực hiện</w:t>
+      </w:r>
+      <w:r>
+        <w:t>, d</w:t>
+      </w:r>
+      <w:r>
+        <w:t>ịch vụ đã thực hiện</w:t>
+      </w:r>
+      <w:r>
+        <w:t>, r</w:t>
+      </w:r>
+      <w:r>
+        <w:t>ăng được điều trị</w:t>
+      </w:r>
+      <w:r>
+        <w:t>, v</w:t>
+      </w:r>
+      <w:r>
+        <w:t>ật liệu sử dụng</w:t>
+      </w:r>
+      <w:r>
+        <w:t>, t</w:t>
+      </w:r>
+      <w:r>
+        <w:t>ình trạng sau điều trị</w:t>
+      </w:r>
+      <w:r>
+        <w:t>)</w:t>
+      </w:r>
+      <w:r>
+        <w:t>.</w:t>
+      </w:r>
+    </w:p>
+    <w:p>
+      <w:r>
+        <w:t xml:space="preserve">B2: </w:t>
+      </w:r>
+      <w:r>
+        <w:t>Bác sĩ ghi nhận</w:t>
+      </w:r>
+      <w:r>
+        <w:t xml:space="preserve"> ( Tiến triển, kết quả, thay đổi kế hoạch điều trị nếu cần).</w:t>
+      </w:r>
+    </w:p>
+    <w:p>
+      <w:r>
+        <w:lastRenderedPageBreak/>
+        <w:t>B3: Tạo lịch hẹn tái khám.</w:t>
+      </w:r>
+    </w:p>
+    <w:p>
+      <w:pPr>
+        <w:rPr>
+          <w:b/>
+          <w:bCs/>
+        </w:rPr>
+      </w:pPr>
+      <w:r>
+        <w:rPr>
+          <w:b/>
+          <w:bCs/>
+        </w:rPr>
+        <w:t>5. Tái khám:</w:t>
+      </w:r>
+    </w:p>
+    <w:p>
+      <w:r>
+        <w:t>B1: Theo dõi kết quả điều trị.</w:t>
+      </w:r>
+    </w:p>
+    <w:p>
+      <w:pPr>
+        <w:rPr>
+          <w:lang w:val="en-US"/>
+        </w:rPr>
+      </w:pPr>
+      <w:r>
+        <w:rPr>
+          <w:lang w:val="en-US"/>
+        </w:rPr>
+        <w:t xml:space="preserve">B2: </w:t>
+      </w:r>
+      <w:proofErr w:type="spellStart"/>
+      <w:r>
+        <w:rPr>
+          <w:lang w:val="en-US"/>
+        </w:rPr>
+        <w:t>Kết</w:t>
+      </w:r>
+      <w:proofErr w:type="spellEnd"/>
+      <w:r>
+        <w:rPr>
+          <w:lang w:val="en-US"/>
+        </w:rPr>
+        <w:t xml:space="preserve"> </w:t>
+      </w:r>
+      <w:proofErr w:type="spellStart"/>
+      <w:r>
+        <w:rPr>
+          <w:lang w:val="en-US"/>
+        </w:rPr>
+        <w:t>thúc</w:t>
+      </w:r>
+      <w:proofErr w:type="spellEnd"/>
+      <w:r>
+        <w:rPr>
+          <w:lang w:val="en-US"/>
+        </w:rPr>
+        <w:t xml:space="preserve"> </w:t>
+      </w:r>
+      <w:proofErr w:type="spellStart"/>
+      <w:r>
+        <w:rPr>
+          <w:lang w:val="en-US"/>
+        </w:rPr>
+        <w:t>điều</w:t>
+      </w:r>
+      <w:proofErr w:type="spellEnd"/>
+      <w:r>
+        <w:rPr>
+          <w:lang w:val="en-US"/>
+        </w:rPr>
+        <w:t xml:space="preserve"> </w:t>
+      </w:r>
+      <w:proofErr w:type="spellStart"/>
+      <w:r>
+        <w:rPr>
+          <w:lang w:val="en-US"/>
+        </w:rPr>
+        <w:t>trị</w:t>
+      </w:r>
+      <w:proofErr w:type="spellEnd"/>
+      <w:r>
+        <w:rPr>
+          <w:lang w:val="en-US"/>
+        </w:rPr>
+        <w:t xml:space="preserve"> </w:t>
+      </w:r>
+      <w:proofErr w:type="spellStart"/>
+      <w:r>
+        <w:rPr>
+          <w:lang w:val="en-US"/>
+        </w:rPr>
+        <w:t>và</w:t>
+      </w:r>
+      <w:proofErr w:type="spellEnd"/>
+      <w:r>
+        <w:rPr>
+          <w:lang w:val="en-US"/>
+        </w:rPr>
+        <w:t xml:space="preserve"> </w:t>
+      </w:r>
+      <w:proofErr w:type="spellStart"/>
+      <w:r>
+        <w:rPr>
+          <w:lang w:val="en-US"/>
+        </w:rPr>
+        <w:t>ghi</w:t>
+      </w:r>
+      <w:proofErr w:type="spellEnd"/>
+      <w:r>
+        <w:rPr>
+          <w:lang w:val="en-US"/>
+        </w:rPr>
+        <w:t xml:space="preserve"> </w:t>
+      </w:r>
+      <w:proofErr w:type="spellStart"/>
+      <w:r>
+        <w:rPr>
+          <w:lang w:val="en-US"/>
+        </w:rPr>
+        <w:t>nhận</w:t>
+      </w:r>
+      <w:proofErr w:type="spellEnd"/>
+      <w:r>
         <w:rPr>
           <w:lang w:val="en-US"/>
         </w:rPr>
@@ -1237,139 +1413,90 @@
         </w:rPr>
         <w:t xml:space="preserve"> tin </w:t>
       </w:r>
-      <w:proofErr w:type="spellStart"/>
-      <w:r>
-        <w:rPr>
-          <w:lang w:val="en-US"/>
-        </w:rPr>
-        <w:t>như</w:t>
-      </w:r>
-      <w:proofErr w:type="spellEnd"/>
-      <w:r>
-        <w:rPr>
-          <w:lang w:val="en-US"/>
-        </w:rPr>
-        <w:t xml:space="preserve"> </w:t>
-      </w:r>
       <w:proofErr w:type="gramStart"/>
       <w:r>
         <w:rPr>
           <w:lang w:val="en-US"/>
         </w:rPr>
-        <w:t>(</w:t>
-      </w:r>
-      <w:r>
-        <w:rPr>
-          <w:lang w:val="en-US"/>
-        </w:rPr>
-        <w:t xml:space="preserve"> </w:t>
-      </w:r>
-      <w:r>
-        <w:t>Ngày</w:t>
-      </w:r>
+        <w:t xml:space="preserve">( </w:t>
+      </w:r>
+      <w:proofErr w:type="spellStart"/>
+      <w:r>
+        <w:rPr>
+          <w:lang w:val="en-US"/>
+        </w:rPr>
+        <w:t>Tình</w:t>
+      </w:r>
+      <w:proofErr w:type="spellEnd"/>
       <w:proofErr w:type="gramEnd"/>
       <w:r>
-        <w:t xml:space="preserve"> điều trị</w:t>
-      </w:r>
-      <w:r>
-        <w:rPr>
-          <w:lang w:val="en-US"/>
-        </w:rPr>
-        <w:t>, b</w:t>
-      </w:r>
-      <w:r>
-        <w:t>ác sĩ thực hiện</w:t>
-      </w:r>
-      <w:r>
-        <w:rPr>
-          <w:lang w:val="en-US"/>
-        </w:rPr>
-        <w:t>, d</w:t>
-      </w:r>
-      <w:r>
-        <w:t>ịch vụ đã thực hiện</w:t>
-      </w:r>
-      <w:r>
-        <w:rPr>
-          <w:lang w:val="en-US"/>
-        </w:rPr>
-        <w:t>, r</w:t>
-      </w:r>
-      <w:r>
-        <w:t>ăng được điều trị</w:t>
-      </w:r>
-      <w:r>
-        <w:rPr>
-          <w:lang w:val="en-US"/>
-        </w:rPr>
-        <w:t>, v</w:t>
-      </w:r>
-      <w:r>
-        <w:t>ật liệu sử dụng</w:t>
-      </w:r>
-      <w:r>
-        <w:rPr>
-          <w:lang w:val="en-US"/>
-        </w:rPr>
-        <w:t>, t</w:t>
-      </w:r>
-      <w:r>
-        <w:t>ình trạng sau điều trị</w:t>
-      </w:r>
-      <w:r>
-        <w:rPr>
-          <w:lang w:val="en-US"/>
-        </w:rPr>
-        <w:t>)</w:t>
-      </w:r>
-      <w:r>
-        <w:rPr>
-          <w:lang w:val="en-US"/>
-        </w:rPr>
-        <w:t>.</w:t>
-      </w:r>
-    </w:p>
-    <w:p>
-      <w:pPr>
-        <w:rPr>
-          <w:lang w:val="en-US"/>
-        </w:rPr>
-      </w:pPr>
-      <w:r>
-        <w:rPr>
-          <w:lang w:val="en-US"/>
-        </w:rPr>
-        <w:t xml:space="preserve">B2: </w:t>
-      </w:r>
-      <w:r>
-        <w:t>Bác sĩ ghi nhận</w:t>
-      </w:r>
-      <w:r>
-        <w:rPr>
-          <w:lang w:val="en-US"/>
-        </w:rPr>
-        <w:t xml:space="preserve"> </w:t>
-      </w:r>
-      <w:proofErr w:type="gramStart"/>
-      <w:r>
-        <w:rPr>
-          <w:lang w:val="en-US"/>
-        </w:rPr>
-        <w:t>( Tiến</w:t>
-      </w:r>
-      <w:proofErr w:type="gramEnd"/>
-      <w:r>
-        <w:rPr>
-          <w:lang w:val="en-US"/>
-        </w:rPr>
-        <w:t xml:space="preserve"> </w:t>
-      </w:r>
-      <w:proofErr w:type="spellStart"/>
-      <w:r>
-        <w:rPr>
-          <w:lang w:val="en-US"/>
-        </w:rPr>
-        <w:t>triển</w:t>
+        <w:rPr>
+          <w:lang w:val="en-US"/>
+        </w:rPr>
+        <w:t xml:space="preserve"> </w:t>
+      </w:r>
+      <w:proofErr w:type="spellStart"/>
+      <w:r>
+        <w:rPr>
+          <w:lang w:val="en-US"/>
+        </w:rPr>
+        <w:t>trạng</w:t>
+      </w:r>
+      <w:proofErr w:type="spellEnd"/>
+      <w:r>
+        <w:rPr>
+          <w:lang w:val="en-US"/>
+        </w:rPr>
+        <w:t xml:space="preserve"> </w:t>
+      </w:r>
+      <w:proofErr w:type="spellStart"/>
+      <w:r>
+        <w:rPr>
+          <w:lang w:val="en-US"/>
+        </w:rPr>
+        <w:t>răng</w:t>
+      </w:r>
+      <w:proofErr w:type="spellEnd"/>
+      <w:r>
+        <w:rPr>
+          <w:lang w:val="en-US"/>
+        </w:rPr>
+        <w:t xml:space="preserve"> </w:t>
+      </w:r>
+      <w:proofErr w:type="spellStart"/>
+      <w:r>
+        <w:rPr>
+          <w:lang w:val="en-US"/>
+        </w:rPr>
+        <w:t>sau</w:t>
+      </w:r>
+      <w:proofErr w:type="spellEnd"/>
+      <w:r>
+        <w:rPr>
+          <w:lang w:val="en-US"/>
+        </w:rPr>
+        <w:t xml:space="preserve"> </w:t>
+      </w:r>
+      <w:proofErr w:type="spellStart"/>
+      <w:r>
+        <w:rPr>
+          <w:lang w:val="en-US"/>
+        </w:rPr>
+        <w:t>điều</w:t>
+      </w:r>
+      <w:proofErr w:type="spellEnd"/>
+      <w:r>
+        <w:rPr>
+          <w:lang w:val="en-US"/>
+        </w:rPr>
+        <w:t xml:space="preserve"> </w:t>
+      </w:r>
+      <w:proofErr w:type="spellStart"/>
+      <w:r>
+        <w:rPr>
+          <w:lang w:val="en-US"/>
+        </w:rPr>
+        <w:t>trị</w:t>
       </w:r>
       <w:proofErr w:type="spellEnd"/>
       <w:r>
@@ -1383,133 +1510,49 @@
         <w:rPr>
           <w:lang w:val="en-US"/>
         </w:rPr>
-        <w:t>kết</w:t>
-      </w:r>
-      <w:proofErr w:type="spellEnd"/>
-      <w:r>
-        <w:rPr>
-          <w:lang w:val="en-US"/>
-        </w:rPr>
-        <w:t xml:space="preserve"> </w:t>
-      </w:r>
-      <w:proofErr w:type="spellStart"/>
-      <w:r>
-        <w:rPr>
-          <w:lang w:val="en-US"/>
-        </w:rPr>
-        <w:t>quả</w:t>
-      </w:r>
-      <w:proofErr w:type="spellEnd"/>
-      <w:r>
-        <w:rPr>
-          <w:lang w:val="en-US"/>
-        </w:rPr>
-        <w:t xml:space="preserve">, </w:t>
-      </w:r>
-      <w:proofErr w:type="spellStart"/>
-      <w:r>
-        <w:rPr>
-          <w:lang w:val="en-US"/>
-        </w:rPr>
-        <w:t>thay</w:t>
-      </w:r>
-      <w:proofErr w:type="spellEnd"/>
-      <w:r>
-        <w:rPr>
-          <w:lang w:val="en-US"/>
-        </w:rPr>
-        <w:t xml:space="preserve"> </w:t>
-      </w:r>
-      <w:proofErr w:type="spellStart"/>
-      <w:r>
-        <w:rPr>
-          <w:lang w:val="en-US"/>
-        </w:rPr>
-        <w:t>đổi</w:t>
-      </w:r>
-      <w:proofErr w:type="spellEnd"/>
-      <w:r>
-        <w:rPr>
-          <w:lang w:val="en-US"/>
-        </w:rPr>
-        <w:t xml:space="preserve"> </w:t>
-      </w:r>
-      <w:proofErr w:type="spellStart"/>
-      <w:r>
-        <w:rPr>
-          <w:lang w:val="en-US"/>
-        </w:rPr>
-        <w:t>kế</w:t>
-      </w:r>
-      <w:proofErr w:type="spellEnd"/>
-      <w:r>
-        <w:rPr>
-          <w:lang w:val="en-US"/>
-        </w:rPr>
-        <w:t xml:space="preserve"> </w:t>
-      </w:r>
-      <w:proofErr w:type="spellStart"/>
-      <w:r>
-        <w:rPr>
-          <w:lang w:val="en-US"/>
-        </w:rPr>
-        <w:t>hoạch</w:t>
-      </w:r>
-      <w:proofErr w:type="spellEnd"/>
-      <w:r>
-        <w:rPr>
-          <w:lang w:val="en-US"/>
-        </w:rPr>
-        <w:t xml:space="preserve"> </w:t>
-      </w:r>
-      <w:proofErr w:type="spellStart"/>
-      <w:r>
-        <w:rPr>
-          <w:lang w:val="en-US"/>
-        </w:rPr>
-        <w:t>điều</w:t>
-      </w:r>
-      <w:proofErr w:type="spellEnd"/>
-      <w:r>
-        <w:rPr>
-          <w:lang w:val="en-US"/>
-        </w:rPr>
-        <w:t xml:space="preserve"> </w:t>
-      </w:r>
-      <w:proofErr w:type="spellStart"/>
-      <w:r>
-        <w:rPr>
-          <w:lang w:val="en-US"/>
-        </w:rPr>
-        <w:t>trị</w:t>
-      </w:r>
-      <w:proofErr w:type="spellEnd"/>
-      <w:r>
-        <w:rPr>
-          <w:lang w:val="en-US"/>
-        </w:rPr>
-        <w:t xml:space="preserve"> </w:t>
-      </w:r>
-      <w:proofErr w:type="spellStart"/>
-      <w:r>
-        <w:rPr>
-          <w:lang w:val="en-US"/>
-        </w:rPr>
-        <w:t>nếu</w:t>
-      </w:r>
-      <w:proofErr w:type="spellEnd"/>
-      <w:r>
-        <w:rPr>
-          <w:lang w:val="en-US"/>
-        </w:rPr>
-        <w:t xml:space="preserve"> </w:t>
-      </w:r>
-      <w:proofErr w:type="spellStart"/>
-      <w:r>
-        <w:rPr>
-          <w:lang w:val="en-US"/>
-        </w:rPr>
-        <w:t>cần</w:t>
+        <w:t>hướng</w:t>
+      </w:r>
+      <w:proofErr w:type="spellEnd"/>
+      <w:r>
+        <w:rPr>
+          <w:lang w:val="en-US"/>
+        </w:rPr>
+        <w:t xml:space="preserve"> </w:t>
+      </w:r>
+      <w:proofErr w:type="spellStart"/>
+      <w:r>
+        <w:rPr>
+          <w:lang w:val="en-US"/>
+        </w:rPr>
+        <w:t>dẫn</w:t>
+      </w:r>
+      <w:proofErr w:type="spellEnd"/>
+      <w:r>
+        <w:rPr>
+          <w:lang w:val="en-US"/>
+        </w:rPr>
+        <w:t xml:space="preserve"> </w:t>
+      </w:r>
+      <w:proofErr w:type="spellStart"/>
+      <w:r>
+        <w:rPr>
+          <w:lang w:val="en-US"/>
+        </w:rPr>
+        <w:t>chăm</w:t>
+      </w:r>
+      <w:proofErr w:type="spellEnd"/>
+      <w:r>
+        <w:rPr>
+          <w:lang w:val="en-US"/>
+        </w:rPr>
+        <w:t xml:space="preserve"> </w:t>
+      </w:r>
+      <w:proofErr w:type="spellStart"/>
+      <w:r>
+        <w:rPr>
+          <w:lang w:val="en-US"/>
+        </w:rPr>
+        <w:t>sóc</w:t>
       </w:r>
       <w:proofErr w:type="spellEnd"/>
       <w:r>
@@ -1522,549 +1565,463 @@
     <w:p>
       <w:pPr>
         <w:rPr>
-          <w:lang w:val="en-US"/>
-        </w:rPr>
-      </w:pPr>
-      <w:r>
-        <w:rPr>
-          <w:lang w:val="en-US"/>
-        </w:rPr>
+          <w:b/>
+          <w:bCs/>
+          <w:lang w:val="en-US"/>
+        </w:rPr>
+      </w:pPr>
+      <w:r>
+        <w:rPr>
+          <w:b/>
+          <w:bCs/>
+          <w:lang w:val="en-US"/>
+        </w:rPr>
+        <w:t xml:space="preserve">II. Quy </w:t>
+      </w:r>
+      <w:proofErr w:type="spellStart"/>
+      <w:r>
+        <w:rPr>
+          <w:b/>
+          <w:bCs/>
+          <w:lang w:val="en-US"/>
+        </w:rPr>
+        <w:t>định</w:t>
+      </w:r>
+      <w:proofErr w:type="spellEnd"/>
+    </w:p>
+    <w:p>
+      <w:pPr>
+        <w:rPr>
+          <w:b/>
+          <w:bCs/>
+          <w:lang w:val="en-US"/>
+        </w:rPr>
+      </w:pPr>
+      <w:r>
+        <w:rPr>
+          <w:b/>
+          <w:bCs/>
+        </w:rPr>
+        <w:t>1. Quy định về khám bệnh</w:t>
+      </w:r>
+    </w:p>
+    <w:p>
+      <w:pPr>
+        <w:rPr>
+          <w:lang w:val="en-US"/>
+        </w:rPr>
+      </w:pPr>
+      <w:r>
+        <w:t>Mỗi lượt đến khám phải tạo một hồ sơ hoặc phiếu khám mới.</w:t>
+      </w:r>
+    </w:p>
+    <w:p>
+      <w:pPr>
+        <w:rPr>
+          <w:lang w:val="en-US"/>
+        </w:rPr>
+      </w:pPr>
+      <w:r>
+        <w:t>Một phiếu khám chỉ do một bác sĩ phụ trách.</w:t>
+      </w:r>
+    </w:p>
+    <w:p>
+      <w:pPr>
+        <w:rPr>
+          <w:lang w:val="en-US"/>
+        </w:rPr>
+      </w:pPr>
+      <w:r>
+        <w:t>Trước khi khám, bác sĩ phải kiểm tra thông tin cá nhân, tiền sử bệnh, dị ứng và hồ sơ khám trước (nếu có).</w:t>
+      </w:r>
+    </w:p>
+    <w:p>
+      <w:pPr>
+        <w:rPr>
+          <w:lang w:val="en-US"/>
+        </w:rPr>
+      </w:pPr>
+      <w:r>
+        <w:t>Kết quả khám lâm sàng phải được ghi vào hồ sơ, bao gồm triệu chứng, tình trạng răng miệng và chỉ định chụp X-quang khi cần.</w:t>
+      </w:r>
+    </w:p>
+    <w:p>
+      <w:pPr>
+        <w:rPr>
+          <w:lang w:val="en-US"/>
+        </w:rPr>
+      </w:pPr>
+      <w:r>
+        <w:t>Không được kết thúc bước khám nếu chưa ghi nhận kết quả khám.</w:t>
+      </w:r>
+    </w:p>
+    <w:p>
+      <w:pPr>
+        <w:rPr>
+          <w:b/>
+          <w:bCs/>
+          <w:lang w:val="en-US"/>
+        </w:rPr>
+      </w:pPr>
+      <w:r>
+        <w:rPr>
+          <w:b/>
+          <w:bCs/>
+        </w:rPr>
+        <w:t>2. Quy định</w:t>
+      </w:r>
+      <w:r>
+        <w:rPr>
+          <w:rFonts w:hint="eastAsia"/>
+          <w:b/>
+          <w:bCs/>
+        </w:rPr>
+        <w:t xml:space="preserve"> </w:t>
+      </w:r>
+      <w:r>
+        <w:rPr>
+          <w:b/>
+          <w:bCs/>
+        </w:rPr>
+        <w:t>chẩn đoán</w:t>
+      </w:r>
+    </w:p>
+    <w:p>
+      <w:pPr>
+        <w:rPr>
+          <w:lang w:val="en-US"/>
+        </w:rPr>
+      </w:pPr>
+      <w:r>
+        <w:t>Một phiếu khám có thể có một hoặc nhiều chẩn đoán.</w:t>
+      </w:r>
+    </w:p>
+    <w:p>
+      <w:pPr>
+        <w:rPr>
+          <w:lang w:val="en-US"/>
+        </w:rPr>
+      </w:pPr>
+      <w:r>
+        <w:t>Mỗi chẩn đoán phải gắn với phiếu khám tương ứng.</w:t>
+      </w:r>
+    </w:p>
+    <w:p>
+      <w:pPr>
+        <w:rPr>
+          <w:lang w:val="en-US"/>
+        </w:rPr>
+      </w:pPr>
+      <w:r>
+        <w:t>Chỉ bác sĩ phụ trách phiếu khám mới được ghi nhận hoặc cập nhật chẩn đoán.</w:t>
+      </w:r>
+    </w:p>
+    <w:p>
+      <w:pPr>
+        <w:rPr>
+          <w:lang w:val="en-US"/>
+        </w:rPr>
+      </w:pPr>
+      <w:r>
+        <w:t>Không được lập kế hoạch điều trị khi chưa có ít nhất một chẩn đoán.</w:t>
+      </w:r>
+    </w:p>
+    <w:p>
+      <w:pPr>
+        <w:rPr>
+          <w:b/>
+          <w:bCs/>
+          <w:lang w:val="en-US"/>
+        </w:rPr>
+      </w:pPr>
+      <w:r>
+        <w:rPr>
+          <w:b/>
+          <w:bCs/>
+        </w:rPr>
+        <w:t>3. Quy định lập kế hoạch điều trị</w:t>
+      </w:r>
+    </w:p>
+    <w:p>
+      <w:pPr>
+        <w:rPr>
+          <w:lang w:val="en-US"/>
+        </w:rPr>
+      </w:pPr>
+      <w:r>
+        <w:t>Kế hoạch điều trị phải ghi rõ:</w:t>
+      </w:r>
+      <w:r>
+        <w:rPr>
+          <w:b/>
+          <w:bCs/>
+        </w:rPr>
+        <w:t xml:space="preserve">  </w:t>
+      </w:r>
+      <w:r>
+        <w:t>tình trạng bệnh,</w:t>
+      </w:r>
+      <w:r>
+        <w:rPr>
+          <w:lang w:val="en-US"/>
+        </w:rPr>
+        <w:t xml:space="preserve"> </w:t>
+      </w:r>
+      <w:r>
+        <w:t>phương án điều trị,</w:t>
+      </w:r>
+      <w:r>
+        <w:rPr>
+          <w:lang w:val="en-US"/>
+        </w:rPr>
+        <w:t xml:space="preserve"> </w:t>
+      </w:r>
+      <w:r>
+        <w:t>thời gian điều trị,</w:t>
+      </w:r>
+      <w:r>
+        <w:rPr>
+          <w:lang w:val="en-US"/>
+        </w:rPr>
+        <w:t xml:space="preserve"> </w:t>
+      </w:r>
+      <w:r>
+        <w:t>chi phí dự kiến,</w:t>
+      </w:r>
+      <w:r>
+        <w:rPr>
+          <w:lang w:val="en-US"/>
+        </w:rPr>
+        <w:t xml:space="preserve"> </w:t>
+      </w:r>
+      <w:r>
+        <w:t>lịch hẹn điều trị.</w:t>
+      </w:r>
+    </w:p>
+    <w:p>
+      <w:pPr>
+        <w:rPr>
+          <w:lang w:val="en-US"/>
+        </w:rPr>
+      </w:pPr>
+      <w:r>
+        <w:t>Một kế hoạch điều trị có thể gồm nhiều dịch vụ hoặc nhiều giai đoạn điều trị.</w:t>
+      </w:r>
+    </w:p>
+    <w:p>
+      <w:pPr>
+        <w:rPr>
+          <w:lang w:val="en-US"/>
+        </w:rPr>
+      </w:pPr>
+      <w:r>
+        <w:t>Chi phí dự kiến phải được tính trước khi xác nhận kế hoạch.</w:t>
+      </w:r>
+    </w:p>
+    <w:p>
+      <w:pPr>
+        <w:rPr>
+          <w:lang w:val="en-US"/>
+        </w:rPr>
+      </w:pPr>
+      <w:r>
+        <w:t>Lịch hẹn đầu tiên phải được tạo khi kế hoạch được xác nhận.</w:t>
+      </w:r>
+    </w:p>
+    <w:p>
+      <w:pPr>
+        <w:rPr>
+          <w:b/>
+          <w:bCs/>
+          <w:lang w:val="en-US"/>
+        </w:rPr>
+      </w:pPr>
+      <w:r>
+        <w:rPr>
+          <w:b/>
+          <w:bCs/>
+        </w:rPr>
+        <w:t>4. Quy định điều trị</w:t>
+      </w:r>
+    </w:p>
+    <w:p>
+      <w:r>
+        <w:t>Sau mỗi lần điều trị phải ghi nhận:</w:t>
+      </w:r>
+      <w:r>
+        <w:rPr>
+          <w:lang w:val="en-US"/>
+        </w:rPr>
+        <w:t xml:space="preserve"> </w:t>
+      </w:r>
+      <w:r>
+        <w:t>ngày điều trị,</w:t>
+      </w:r>
+      <w:r>
+        <w:rPr>
+          <w:lang w:val="en-US"/>
+        </w:rPr>
+        <w:t xml:space="preserve"> </w:t>
+      </w:r>
+      <w:r>
+        <w:t>bác sĩ thực hiện,</w:t>
+      </w:r>
+      <w:r>
+        <w:rPr>
+          <w:lang w:val="en-US"/>
+        </w:rPr>
+        <w:t xml:space="preserve"> </w:t>
+      </w:r>
+      <w:r>
+        <w:t>dịch vụ đã thực hiện,</w:t>
+      </w:r>
+      <w:r>
+        <w:rPr>
+          <w:lang w:val="en-US"/>
+        </w:rPr>
+        <w:t xml:space="preserve"> </w:t>
+      </w:r>
+      <w:r>
+        <w:t>răng được điều trị,</w:t>
+      </w:r>
+      <w:r>
+        <w:rPr>
+          <w:lang w:val="en-US"/>
+        </w:rPr>
+        <w:t xml:space="preserve"> </w:t>
+      </w:r>
+      <w:r>
+        <w:t>vật liệu sử dụng (nếu có),</w:t>
+      </w:r>
+      <w:r>
+        <w:rPr>
+          <w:lang w:val="en-US"/>
+        </w:rPr>
+        <w:t xml:space="preserve"> </w:t>
+      </w:r>
+      <w:r>
+        <w:t>tình trạng sau điều trị.</w:t>
+      </w:r>
+    </w:p>
+    <w:p>
+      <w:pPr>
+        <w:rPr>
+          <w:lang w:val="en-US"/>
+        </w:rPr>
+      </w:pPr>
+      <w:r>
+        <w:t>Bác sĩ phải cập nhật tiến triển và kết quả điều trị.</w:t>
+      </w:r>
+    </w:p>
+    <w:p>
+      <w:pPr>
+        <w:rPr>
+          <w:lang w:val="en-US"/>
+        </w:rPr>
+      </w:pPr>
+      <w:r>
+        <w:t>Nếu kế hoạch điều trị thay đổi thì phải ghi nhận lý do điều chỉnh.</w:t>
+      </w:r>
+    </w:p>
+    <w:p>
+      <w:r>
+        <w:t>Sau mỗi buổi điều trị phải tạo lịch tái khám khi cần.</w:t>
+      </w:r>
+    </w:p>
+    <w:p>
+      <w:r>
         <w:lastRenderedPageBreak/>
-        <w:t xml:space="preserve">B3: </w:t>
-      </w:r>
-      <w:proofErr w:type="spellStart"/>
-      <w:r>
-        <w:rPr>
-          <w:lang w:val="en-US"/>
-        </w:rPr>
-        <w:t>Tạo</w:t>
-      </w:r>
-      <w:proofErr w:type="spellEnd"/>
-      <w:r>
-        <w:rPr>
-          <w:lang w:val="en-US"/>
-        </w:rPr>
-        <w:t xml:space="preserve"> </w:t>
-      </w:r>
-      <w:proofErr w:type="spellStart"/>
-      <w:r>
-        <w:rPr>
-          <w:lang w:val="en-US"/>
-        </w:rPr>
-        <w:t>lịch</w:t>
-      </w:r>
-      <w:proofErr w:type="spellEnd"/>
-      <w:r>
-        <w:rPr>
-          <w:lang w:val="en-US"/>
-        </w:rPr>
-        <w:t xml:space="preserve"> </w:t>
-      </w:r>
-      <w:proofErr w:type="spellStart"/>
-      <w:r>
-        <w:rPr>
-          <w:lang w:val="en-US"/>
-        </w:rPr>
-        <w:t>hẹn</w:t>
-      </w:r>
-      <w:proofErr w:type="spellEnd"/>
-      <w:r>
-        <w:rPr>
-          <w:lang w:val="en-US"/>
-        </w:rPr>
-        <w:t xml:space="preserve"> </w:t>
-      </w:r>
-      <w:proofErr w:type="spellStart"/>
-      <w:r>
-        <w:rPr>
-          <w:lang w:val="en-US"/>
-        </w:rPr>
-        <w:t>tái</w:t>
-      </w:r>
-      <w:proofErr w:type="spellEnd"/>
-      <w:r>
-        <w:rPr>
-          <w:lang w:val="en-US"/>
-        </w:rPr>
-        <w:t xml:space="preserve"> </w:t>
-      </w:r>
-      <w:proofErr w:type="spellStart"/>
-      <w:r>
-        <w:rPr>
-          <w:lang w:val="en-US"/>
-        </w:rPr>
-        <w:t>khám</w:t>
-      </w:r>
-      <w:proofErr w:type="spellEnd"/>
-      <w:r>
-        <w:rPr>
-          <w:lang w:val="en-US"/>
-        </w:rPr>
-        <w:t>.</w:t>
-      </w:r>
-    </w:p>
-    <w:p>
-      <w:pPr>
-        <w:rPr>
-          <w:b/>
-          <w:bCs/>
-          <w:lang w:val="en-US"/>
-        </w:rPr>
-      </w:pPr>
-      <w:r>
-        <w:rPr>
-          <w:b/>
-          <w:bCs/>
-          <w:lang w:val="en-US"/>
-        </w:rPr>
-        <w:t xml:space="preserve">5. Tái </w:t>
-      </w:r>
-      <w:proofErr w:type="spellStart"/>
-      <w:r>
-        <w:rPr>
-          <w:b/>
-          <w:bCs/>
-          <w:lang w:val="en-US"/>
-        </w:rPr>
-        <w:t>khám</w:t>
-      </w:r>
-      <w:proofErr w:type="spellEnd"/>
-      <w:r>
-        <w:rPr>
-          <w:b/>
-          <w:bCs/>
-          <w:lang w:val="en-US"/>
-        </w:rPr>
-        <w:t>:</w:t>
-      </w:r>
-    </w:p>
-    <w:p>
-      <w:pPr>
-        <w:rPr>
-          <w:lang w:val="en-US"/>
-        </w:rPr>
-      </w:pPr>
-      <w:r>
-        <w:rPr>
-          <w:lang w:val="en-US"/>
-        </w:rPr>
-        <w:t xml:space="preserve">B1: Theo </w:t>
-      </w:r>
-      <w:proofErr w:type="spellStart"/>
-      <w:r>
-        <w:rPr>
-          <w:lang w:val="en-US"/>
-        </w:rPr>
-        <w:t>dõi</w:t>
-      </w:r>
-      <w:proofErr w:type="spellEnd"/>
-      <w:r>
-        <w:rPr>
-          <w:lang w:val="en-US"/>
-        </w:rPr>
-        <w:t xml:space="preserve"> </w:t>
-      </w:r>
-      <w:proofErr w:type="spellStart"/>
-      <w:r>
-        <w:rPr>
-          <w:lang w:val="en-US"/>
-        </w:rPr>
-        <w:t>kết</w:t>
-      </w:r>
-      <w:proofErr w:type="spellEnd"/>
-      <w:r>
-        <w:rPr>
-          <w:lang w:val="en-US"/>
-        </w:rPr>
-        <w:t xml:space="preserve"> </w:t>
-      </w:r>
-      <w:proofErr w:type="spellStart"/>
-      <w:r>
-        <w:rPr>
-          <w:lang w:val="en-US"/>
-        </w:rPr>
-        <w:t>quả</w:t>
-      </w:r>
-      <w:proofErr w:type="spellEnd"/>
-      <w:r>
-        <w:rPr>
-          <w:lang w:val="en-US"/>
-        </w:rPr>
-        <w:t xml:space="preserve"> </w:t>
-      </w:r>
-      <w:proofErr w:type="spellStart"/>
-      <w:r>
-        <w:rPr>
-          <w:lang w:val="en-US"/>
-        </w:rPr>
-        <w:t>điều</w:t>
-      </w:r>
-      <w:proofErr w:type="spellEnd"/>
-      <w:r>
-        <w:rPr>
-          <w:lang w:val="en-US"/>
-        </w:rPr>
-        <w:t xml:space="preserve"> </w:t>
-      </w:r>
-      <w:proofErr w:type="spellStart"/>
-      <w:r>
-        <w:rPr>
-          <w:lang w:val="en-US"/>
-        </w:rPr>
-        <w:t>trị</w:t>
-      </w:r>
-      <w:proofErr w:type="spellEnd"/>
-      <w:r>
-        <w:rPr>
-          <w:lang w:val="en-US"/>
-        </w:rPr>
-        <w:t>.</w:t>
-      </w:r>
-    </w:p>
-    <w:p>
-      <w:pPr>
-        <w:rPr>
-          <w:lang w:val="en-US"/>
-        </w:rPr>
-      </w:pPr>
-      <w:r>
-        <w:rPr>
-          <w:lang w:val="en-US"/>
-        </w:rPr>
-        <w:t xml:space="preserve">B2: </w:t>
-      </w:r>
-      <w:proofErr w:type="spellStart"/>
-      <w:r>
-        <w:rPr>
-          <w:lang w:val="en-US"/>
-        </w:rPr>
-        <w:t>Kết</w:t>
-      </w:r>
-      <w:proofErr w:type="spellEnd"/>
-      <w:r>
-        <w:rPr>
-          <w:lang w:val="en-US"/>
-        </w:rPr>
-        <w:t xml:space="preserve"> </w:t>
-      </w:r>
-      <w:proofErr w:type="spellStart"/>
-      <w:r>
-        <w:rPr>
-          <w:lang w:val="en-US"/>
-        </w:rPr>
-        <w:t>thúc</w:t>
-      </w:r>
-      <w:proofErr w:type="spellEnd"/>
-      <w:r>
-        <w:rPr>
-          <w:lang w:val="en-US"/>
-        </w:rPr>
-        <w:t xml:space="preserve"> </w:t>
-      </w:r>
-      <w:proofErr w:type="spellStart"/>
-      <w:r>
-        <w:rPr>
-          <w:lang w:val="en-US"/>
-        </w:rPr>
-        <w:t>điều</w:t>
-      </w:r>
-      <w:proofErr w:type="spellEnd"/>
-      <w:r>
-        <w:rPr>
-          <w:lang w:val="en-US"/>
-        </w:rPr>
-        <w:t xml:space="preserve"> </w:t>
-      </w:r>
-      <w:proofErr w:type="spellStart"/>
-      <w:r>
-        <w:rPr>
-          <w:lang w:val="en-US"/>
-        </w:rPr>
-        <w:t>trị</w:t>
-      </w:r>
-      <w:proofErr w:type="spellEnd"/>
-      <w:r>
-        <w:rPr>
-          <w:lang w:val="en-US"/>
-        </w:rPr>
-        <w:t xml:space="preserve"> </w:t>
-      </w:r>
-      <w:proofErr w:type="spellStart"/>
-      <w:r>
-        <w:rPr>
-          <w:lang w:val="en-US"/>
-        </w:rPr>
-        <w:t>và</w:t>
-      </w:r>
-      <w:proofErr w:type="spellEnd"/>
-      <w:r>
-        <w:rPr>
-          <w:lang w:val="en-US"/>
-        </w:rPr>
-        <w:t xml:space="preserve"> </w:t>
-      </w:r>
-      <w:proofErr w:type="spellStart"/>
-      <w:r>
-        <w:rPr>
-          <w:lang w:val="en-US"/>
-        </w:rPr>
-        <w:t>ghi</w:t>
-      </w:r>
-      <w:proofErr w:type="spellEnd"/>
-      <w:r>
-        <w:rPr>
-          <w:lang w:val="en-US"/>
-        </w:rPr>
-        <w:t xml:space="preserve"> </w:t>
-      </w:r>
-      <w:proofErr w:type="spellStart"/>
-      <w:r>
-        <w:rPr>
-          <w:lang w:val="en-US"/>
-        </w:rPr>
-        <w:t>nhận</w:t>
-      </w:r>
-      <w:proofErr w:type="spellEnd"/>
-      <w:r>
-        <w:rPr>
-          <w:lang w:val="en-US"/>
-        </w:rPr>
-        <w:t xml:space="preserve"> </w:t>
-      </w:r>
-      <w:proofErr w:type="spellStart"/>
-      <w:r>
-        <w:rPr>
-          <w:lang w:val="en-US"/>
-        </w:rPr>
-        <w:t>các</w:t>
-      </w:r>
-      <w:proofErr w:type="spellEnd"/>
-      <w:r>
-        <w:rPr>
-          <w:lang w:val="en-US"/>
-        </w:rPr>
-        <w:t xml:space="preserve"> </w:t>
-      </w:r>
-      <w:proofErr w:type="spellStart"/>
-      <w:r>
-        <w:rPr>
-          <w:lang w:val="en-US"/>
-        </w:rPr>
-        <w:t>thông</w:t>
-      </w:r>
-      <w:proofErr w:type="spellEnd"/>
-      <w:r>
-        <w:rPr>
-          <w:lang w:val="en-US"/>
-        </w:rPr>
-        <w:t xml:space="preserve"> tin </w:t>
-      </w:r>
-      <w:proofErr w:type="gramStart"/>
-      <w:r>
-        <w:rPr>
-          <w:lang w:val="en-US"/>
-        </w:rPr>
-        <w:t xml:space="preserve">( </w:t>
-      </w:r>
-      <w:proofErr w:type="spellStart"/>
-      <w:r>
-        <w:rPr>
-          <w:lang w:val="en-US"/>
-        </w:rPr>
-        <w:t>Tình</w:t>
-      </w:r>
-      <w:proofErr w:type="spellEnd"/>
-      <w:proofErr w:type="gramEnd"/>
-      <w:r>
-        <w:rPr>
-          <w:lang w:val="en-US"/>
-        </w:rPr>
-        <w:t xml:space="preserve"> </w:t>
-      </w:r>
-      <w:proofErr w:type="spellStart"/>
-      <w:r>
-        <w:rPr>
-          <w:lang w:val="en-US"/>
-        </w:rPr>
-        <w:t>trạng</w:t>
-      </w:r>
-      <w:proofErr w:type="spellEnd"/>
-      <w:r>
-        <w:rPr>
-          <w:lang w:val="en-US"/>
-        </w:rPr>
-        <w:t xml:space="preserve"> </w:t>
-      </w:r>
-      <w:proofErr w:type="spellStart"/>
-      <w:r>
-        <w:rPr>
-          <w:lang w:val="en-US"/>
-        </w:rPr>
-        <w:t>răng</w:t>
-      </w:r>
-      <w:proofErr w:type="spellEnd"/>
-      <w:r>
-        <w:rPr>
-          <w:lang w:val="en-US"/>
-        </w:rPr>
-        <w:t xml:space="preserve"> </w:t>
-      </w:r>
-      <w:proofErr w:type="spellStart"/>
-      <w:r>
-        <w:rPr>
-          <w:lang w:val="en-US"/>
-        </w:rPr>
-        <w:t>sau</w:t>
-      </w:r>
-      <w:proofErr w:type="spellEnd"/>
-      <w:r>
-        <w:rPr>
-          <w:lang w:val="en-US"/>
-        </w:rPr>
-        <w:t xml:space="preserve"> </w:t>
-      </w:r>
-      <w:proofErr w:type="spellStart"/>
-      <w:r>
-        <w:rPr>
-          <w:lang w:val="en-US"/>
-        </w:rPr>
-        <w:t>điều</w:t>
-      </w:r>
-      <w:proofErr w:type="spellEnd"/>
-      <w:r>
-        <w:rPr>
-          <w:lang w:val="en-US"/>
-        </w:rPr>
-        <w:t xml:space="preserve"> </w:t>
-      </w:r>
-      <w:proofErr w:type="spellStart"/>
-      <w:r>
-        <w:rPr>
-          <w:lang w:val="en-US"/>
-        </w:rPr>
-        <w:t>trị</w:t>
-      </w:r>
-      <w:proofErr w:type="spellEnd"/>
-      <w:r>
-        <w:rPr>
-          <w:lang w:val="en-US"/>
-        </w:rPr>
-        <w:t xml:space="preserve">, </w:t>
-      </w:r>
-      <w:proofErr w:type="spellStart"/>
-      <w:r>
-        <w:rPr>
-          <w:lang w:val="en-US"/>
-        </w:rPr>
-        <w:t>hướng</w:t>
-      </w:r>
-      <w:proofErr w:type="spellEnd"/>
-      <w:r>
-        <w:rPr>
-          <w:lang w:val="en-US"/>
-        </w:rPr>
-        <w:t xml:space="preserve"> </w:t>
-      </w:r>
-      <w:proofErr w:type="spellStart"/>
-      <w:r>
-        <w:rPr>
-          <w:lang w:val="en-US"/>
-        </w:rPr>
-        <w:t>dẫn</w:t>
-      </w:r>
-      <w:proofErr w:type="spellEnd"/>
-      <w:r>
-        <w:rPr>
-          <w:lang w:val="en-US"/>
-        </w:rPr>
-        <w:t xml:space="preserve"> </w:t>
-      </w:r>
-      <w:proofErr w:type="spellStart"/>
-      <w:r>
-        <w:rPr>
-          <w:lang w:val="en-US"/>
-        </w:rPr>
-        <w:t>chăm</w:t>
-      </w:r>
-      <w:proofErr w:type="spellEnd"/>
-      <w:r>
-        <w:rPr>
-          <w:lang w:val="en-US"/>
-        </w:rPr>
-        <w:t xml:space="preserve"> </w:t>
-      </w:r>
-      <w:proofErr w:type="spellStart"/>
-      <w:r>
-        <w:rPr>
-          <w:lang w:val="en-US"/>
-        </w:rPr>
-        <w:t>sóc</w:t>
-      </w:r>
-      <w:proofErr w:type="spellEnd"/>
-      <w:r>
-        <w:rPr>
-          <w:lang w:val="en-US"/>
-        </w:rPr>
-        <w:t>).</w:t>
-      </w:r>
-    </w:p>
-    <w:p>
-      <w:pPr>
-        <w:rPr>
-          <w:b/>
-          <w:bCs/>
-          <w:lang w:val="en-US"/>
-        </w:rPr>
-      </w:pPr>
-      <w:r>
-        <w:rPr>
-          <w:b/>
-          <w:bCs/>
-          <w:lang w:val="en-US"/>
-        </w:rPr>
-        <w:t xml:space="preserve">II. Quy </w:t>
-      </w:r>
-      <w:proofErr w:type="spellStart"/>
-      <w:r>
-        <w:rPr>
-          <w:b/>
-          <w:bCs/>
-          <w:lang w:val="en-US"/>
-        </w:rPr>
-        <w:t>định</w:t>
-      </w:r>
-      <w:proofErr w:type="spellEnd"/>
-    </w:p>
-    <w:p>
-      <w:pPr>
-        <w:rPr>
-          <w:b/>
-          <w:bCs/>
-          <w:lang w:val="en-US"/>
-        </w:rPr>
-      </w:pPr>
-      <w:r>
-        <w:rPr>
-          <w:b/>
-          <w:bCs/>
-          <w:lang w:val="en-US"/>
-        </w:rPr>
-        <w:t xml:space="preserve"> </w:t>
-      </w:r>
-    </w:p>
-    <w:p>
-      <w:pPr>
-        <w:rPr>
-          <w:lang w:val="en-US"/>
+        <w:t>Không được đánh dấu hoàn thành điều trị nếu chưa cập nhật kết quả buổi điều trị cuối.</w:t>
+      </w:r>
+    </w:p>
+    <w:p>
+      <w:r>
+        <w:t>Mỗi buổi điều trị phải gắn với một kế hoạch điều trị hợp lệ.</w:t>
+      </w:r>
+    </w:p>
+    <w:p>
+      <w:pPr>
+        <w:rPr>
+          <w:b/>
+          <w:bCs/>
+        </w:rPr>
+      </w:pPr>
+      <w:r>
+        <w:rPr>
+          <w:b/>
+          <w:bCs/>
+        </w:rPr>
+        <w:t>5. Quy định tái khám</w:t>
+      </w:r>
+    </w:p>
+    <w:p>
+      <w:r>
+        <w:t>Mỗi lần tái khám phải ghi nhận kết quả theo dõi.</w:t>
+      </w:r>
+    </w:p>
+    <w:p>
+      <w:pPr>
+        <w:rPr>
+          <w:rFonts w:hint="eastAsia"/>
+        </w:rPr>
+      </w:pPr>
+      <w:r>
+        <w:t>Khi kết thúc điều trị phải cập nhật:</w:t>
+      </w:r>
+      <w:r>
+        <w:rPr>
+          <w:rFonts w:hint="eastAsia"/>
+        </w:rPr>
+        <w:t xml:space="preserve"> </w:t>
+      </w:r>
+      <w:r>
+        <w:t>tình trạng răng sau điều trị,</w:t>
+      </w:r>
+      <w:r>
+        <w:rPr>
+          <w:rFonts w:hint="eastAsia"/>
+        </w:rPr>
+        <w:t xml:space="preserve"> </w:t>
+      </w:r>
+      <w:r>
+        <w:t>hướng dẫn chăm sóc,</w:t>
+      </w:r>
+      <w:r>
+        <w:rPr>
+          <w:rFonts w:hint="eastAsia"/>
+        </w:rPr>
+        <w:t xml:space="preserve"> </w:t>
+      </w:r>
+      <w:r>
+        <w:t>thời điểm hoàn thành điều trị.</w:t>
+      </w:r>
+    </w:p>
+    <w:p>
+      <w:r>
+        <w:t>Nếu cần tiếp tục điều trị thì phải tạo lịch hẹn tái khám tiếp theo.</w:t>
+      </w:r>
+    </w:p>
+    <w:p>
+      <w:r>
+        <w:t>Không được kết thúc hồ sơ điều trị nếu chưa ghi nhận tình trạng sau điều trị.</w:t>
+      </w:r>
+    </w:p>
+    <w:p>
+      <w:r>
+        <w:t>Hồ sơ tái khám phải liên kết với lần điều trị trước đó để theo dõi xuyên suốt.</w:t>
+      </w:r>
+    </w:p>
+    <w:p>
+      <w:pPr>
+        <w:rPr>
+          <w:b/>
+          <w:bCs/>
         </w:rPr>
       </w:pPr>
       <w:r>
         <w:t>Luật Khám bệnh, chữa bệnh số 15/2023/QH15</w:t>
       </w:r>
       <w:r>
-        <w:rPr>
-          <w:lang w:val="en-US"/>
-        </w:rPr>
         <w:t xml:space="preserve">: </w:t>
       </w:r>
       <w:r>
@@ -2074,14 +2031,40 @@
     <w:p>
       <w:pPr>
         <w:rPr>
-          <w:lang w:val="en-US"/>
-        </w:rPr>
-      </w:pPr>
+          <w:rFonts w:hint="eastAsia"/>
+          <w:b/>
+          <w:bCs/>
+        </w:rPr>
+      </w:pPr>
+      <w:r>
+        <w:rPr>
+          <w:rFonts w:hint="eastAsia"/>
+          <w:b/>
+          <w:bCs/>
+        </w:rPr>
+        <w:t>Tham kh</w:t>
+      </w:r>
+      <w:r>
+        <w:rPr>
+          <w:b/>
+          <w:bCs/>
+        </w:rPr>
+        <w:t>ả</w:t>
+      </w:r>
+      <w:r>
+        <w:rPr>
+          <w:rFonts w:hint="eastAsia"/>
+          <w:b/>
+          <w:bCs/>
+        </w:rPr>
+        <w:t>o</w:t>
+      </w:r>
+    </w:p>
+    <w:p>
       <w:hyperlink r:id="rId5" w:history="1">
         <w:r>
           <w:rPr>
             <w:rStyle w:val="Hyperlink"/>
-            <w:lang w:val="en-US"/>
           </w:rPr>
           <w:t>https://vanban.chinhphu.vn/?pageid=27160&amp;docid=207396</w:t>
         </w:r>
@@ -2289,6 +2272,119 @@
     </w:lvl>
   </w:abstractNum>
   <w:abstractNum w:abstractNumId="1" w15:restartNumberingAfterBreak="0">
+    <w:nsid w:val="1106426B"/>
+    <w:multiLevelType w:val="hybridMultilevel"/>
+    <w:tmpl w:val="65B8CE7C"/>
+    <w:lvl w:ilvl="0" w:tplc="042A0001">
+      <w:start w:val="1"/>
+      <w:numFmt w:val="bullet"/>
+      <w:lvlText w:val=""/>
+      <w:lvlJc w:val="left"/>
+      <w:pPr>
+        <w:ind w:left="720" w:hanging="360"/>
+      </w:pPr>
+      <w:rPr>
+        <w:rFonts w:ascii="Symbol" w:hAnsi="Symbol" w:hint="default"/>
+      </w:rPr>
+    </w:lvl>
+    <w:lvl w:ilvl="1" w:tplc="042A0003" w:tentative="1">
+      <w:start w:val="1"/>
+      <w:numFmt w:val="bullet"/>
+      <w:lvlText w:val="o"/>
+      <w:lvlJc w:val="left"/>
+      <w:pPr>
+        <w:ind w:left="1440" w:hanging="360"/>
+      </w:pPr>
+      <w:rPr>
+        <w:rFonts w:ascii="Courier New" w:hAnsi="Courier New" w:cs="Courier New" w:hint="default"/>
+      </w:rPr>
+    </w:lvl>
+    <w:lvl w:ilvl="2" w:tplc="042A0005" w:tentative="1">
+      <w:start w:val="1"/>
+      <w:numFmt w:val="bullet"/>
+      <w:lvlText w:val=""/>
+      <w:lvlJc w:val="left"/>
+      <w:pPr>
+        <w:ind w:left="2160" w:hanging="360"/>
+      </w:pPr>
+      <w:rPr>
+        <w:rFonts w:ascii="Wingdings" w:hAnsi="Wingdings" w:hint="default"/>
+      </w:rPr>
+    </w:lvl>
+    <w:lvl w:ilvl="3" w:tplc="042A0001" w:tentative="1">
+      <w:start w:val="1"/>
+      <w:numFmt w:val="bullet"/>
+      <w:lvlText w:val=""/>
+      <w:lvlJc w:val="left"/>
+      <w:pPr>
+        <w:ind w:left="2880" w:hanging="360"/>
+      </w:pPr>
+      <w:rPr>
+        <w:rFonts w:ascii="Symbol" w:hAnsi="Symbol" w:hint="default"/>
+      </w:rPr>
+    </w:lvl>
+    <w:lvl w:ilvl="4" w:tplc="042A0003" w:tentative="1">
+      <w:start w:val="1"/>
+      <w:numFmt w:val="bullet"/>
+      <w:lvlText w:val="o"/>
+      <w:lvlJc w:val="left"/>
+      <w:pPr>
+        <w:ind w:left="3600" w:hanging="360"/>
+      </w:pPr>
+      <w:rPr>
+        <w:rFonts w:ascii="Courier New" w:hAnsi="Courier New" w:cs="Courier New" w:hint="default"/>
+      </w:rPr>
+    </w:lvl>
+    <w:lvl w:ilvl="5" w:tplc="042A0005" w:tentative="1">
+      <w:start w:val="1"/>
+      <w:numFmt w:val="bullet"/>
+      <w:lvlText w:val=""/>
+      <w:lvlJc w:val="left"/>
+      <w:pPr>
+        <w:ind w:left="4320" w:hanging="360"/>
+      </w:pPr>
+      <w:rPr>
+        <w:rFonts w:ascii="Wingdings" w:hAnsi="Wingdings" w:hint="default"/>
+      </w:rPr>
+    </w:lvl>
+    <w:lvl w:ilvl="6" w:tplc="042A0001" w:tentative="1">
+      <w:start w:val="1"/>
+      <w:numFmt w:val="bullet"/>
+      <w:lvlText w:val=""/>
+      <w:lvlJc w:val="left"/>
+      <w:pPr>
+        <w:ind w:left="5040" w:hanging="360"/>
+      </w:pPr>
+      <w:rPr>
+        <w:rFonts w:ascii="Symbol" w:hAnsi="Symbol" w:hint="default"/>
+      </w:rPr>
+    </w:lvl>
+    <w:lvl w:ilvl="7" w:tplc="042A0003" w:tentative="1">
+      <w:start w:val="1"/>
+      <w:numFmt w:val="bullet"/>
+      <w:lvlText w:val="o"/>
+      <w:lvlJc w:val="left"/>
+      <w:pPr>
+        <w:ind w:left="5760" w:hanging="360"/>
+      </w:pPr>
+      <w:rPr>
+        <w:rFonts w:ascii="Courier New" w:hAnsi="Courier New" w:cs="Courier New" w:hint="default"/>
+      </w:rPr>
+    </w:lvl>
+    <w:lvl w:ilvl="8" w:tplc="042A0005" w:tentative="1">
+      <w:start w:val="1"/>
+      <w:numFmt w:val="bullet"/>
+      <w:lvlText w:val=""/>
+      <w:lvlJc w:val="left"/>
+      <w:pPr>
+        <w:ind w:left="6480" w:hanging="360"/>
+      </w:pPr>
+      <w:rPr>
+        <w:rFonts w:ascii="Wingdings" w:hAnsi="Wingdings" w:hint="default"/>
+      </w:rPr>
+    </w:lvl>
+  </w:abstractNum>
+  <w:abstractNum w:abstractNumId="2" w15:restartNumberingAfterBreak="0">
     <w:nsid w:val="2C2957C1"/>
     <w:multiLevelType w:val="hybridMultilevel"/>
     <w:tmpl w:val="E6F83EB2"/>
@@ -2400,7 +2496,7 @@
       </w:rPr>
     </w:lvl>
   </w:abstractNum>
-  <w:abstractNum w:abstractNumId="2" w15:restartNumberingAfterBreak="0">
+  <w:abstractNum w:abstractNumId="3" w15:restartNumberingAfterBreak="0">
     <w:nsid w:val="36E06274"/>
     <w:multiLevelType w:val="multilevel"/>
     <w:tmpl w:val="78027986"/>
@@ -2549,7 +2645,7 @@
       </w:rPr>
     </w:lvl>
   </w:abstractNum>
-  <w:abstractNum w:abstractNumId="3" w15:restartNumberingAfterBreak="0">
+  <w:abstractNum w:abstractNumId="4" w15:restartNumberingAfterBreak="0">
     <w:nsid w:val="43A73085"/>
     <w:multiLevelType w:val="hybridMultilevel"/>
     <w:tmpl w:val="5B2620C8"/>
@@ -2662,7 +2758,7 @@
       </w:rPr>
     </w:lvl>
   </w:abstractNum>
-  <w:abstractNum w:abstractNumId="4" w15:restartNumberingAfterBreak="0">
+  <w:abstractNum w:abstractNumId="5" w15:restartNumberingAfterBreak="0">
     <w:nsid w:val="45A21F07"/>
     <w:multiLevelType w:val="hybridMultilevel"/>
     <w:tmpl w:val="BB66E598"/>
@@ -2774,7 +2870,120 @@
       </w:rPr>
     </w:lvl>
   </w:abstractNum>
-  <w:abstractNum w:abstractNumId="5" w15:restartNumberingAfterBreak="0">
+  <w:abstractNum w:abstractNumId="6" w15:restartNumberingAfterBreak="0">
+    <w:nsid w:val="4A9740C4"/>
+    <w:multiLevelType w:val="hybridMultilevel"/>
+    <w:tmpl w:val="C21C6572"/>
+    <w:lvl w:ilvl="0" w:tplc="042A0001">
+      <w:start w:val="1"/>
+      <w:numFmt w:val="bullet"/>
+      <w:lvlText w:val=""/>
+      <w:lvlJc w:val="left"/>
+      <w:pPr>
+        <w:ind w:left="720" w:hanging="360"/>
+      </w:pPr>
+      <w:rPr>
+        <w:rFonts w:ascii="Symbol" w:hAnsi="Symbol" w:hint="default"/>
+      </w:rPr>
+    </w:lvl>
+    <w:lvl w:ilvl="1" w:tplc="042A0003" w:tentative="1">
+      <w:start w:val="1"/>
+      <w:numFmt w:val="bullet"/>
+      <w:lvlText w:val="o"/>
+      <w:lvlJc w:val="left"/>
+      <w:pPr>
+        <w:ind w:left="1440" w:hanging="360"/>
+      </w:pPr>
+      <w:rPr>
+        <w:rFonts w:ascii="Courier New" w:hAnsi="Courier New" w:cs="Courier New" w:hint="default"/>
+      </w:rPr>
+    </w:lvl>
+    <w:lvl w:ilvl="2" w:tplc="042A0005" w:tentative="1">
+      <w:start w:val="1"/>
+      <w:numFmt w:val="bullet"/>
+      <w:lvlText w:val=""/>
+      <w:lvlJc w:val="left"/>
+      <w:pPr>
+        <w:ind w:left="2160" w:hanging="360"/>
+      </w:pPr>
+      <w:rPr>
+        <w:rFonts w:ascii="Wingdings" w:hAnsi="Wingdings" w:hint="default"/>
+      </w:rPr>
+    </w:lvl>
+    <w:lvl w:ilvl="3" w:tplc="042A0001" w:tentative="1">
+      <w:start w:val="1"/>
+      <w:numFmt w:val="bullet"/>
+      <w:lvlText w:val=""/>
+      <w:lvlJc w:val="left"/>
+      <w:pPr>
+        <w:ind w:left="2880" w:hanging="360"/>
+      </w:pPr>
+      <w:rPr>
+        <w:rFonts w:ascii="Symbol" w:hAnsi="Symbol" w:hint="default"/>
+      </w:rPr>
+    </w:lvl>
+    <w:lvl w:ilvl="4" w:tplc="042A0003" w:tentative="1">
+      <w:start w:val="1"/>
+      <w:numFmt w:val="bullet"/>
+      <w:lvlText w:val="o"/>
+      <w:lvlJc w:val="left"/>
+      <w:pPr>
+        <w:ind w:left="3600" w:hanging="360"/>
+      </w:pPr>
+      <w:rPr>
+        <w:rFonts w:ascii="Courier New" w:hAnsi="Courier New" w:cs="Courier New" w:hint="default"/>
+      </w:rPr>
+    </w:lvl>
+    <w:lvl w:ilvl="5" w:tplc="042A0005" w:tentative="1">
+      <w:start w:val="1"/>
+      <w:numFmt w:val="bullet"/>
+      <w:lvlText w:val=""/>
+      <w:lvlJc w:val="left"/>
+      <w:pPr>
+        <w:ind w:left="4320" w:hanging="360"/>
+      </w:pPr>
+      <w:rPr>
+        <w:rFonts w:ascii="Wingdings" w:hAnsi="Wingdings" w:hint="default"/>
+      </w:rPr>
+    </w:lvl>
+    <w:lvl w:ilvl="6" w:tplc="042A0001" w:tentative="1">
+      <w:start w:val="1"/>
+      <w:numFmt w:val="bullet"/>
+      <w:lvlText w:val=""/>
+      <w:lvlJc w:val="left"/>
+      <w:pPr>
+        <w:ind w:left="5040" w:hanging="360"/>
+      </w:pPr>
+      <w:rPr>
+        <w:rFonts w:ascii="Symbol" w:hAnsi="Symbol" w:hint="default"/>
+      </w:rPr>
+    </w:lvl>
+    <w:lvl w:ilvl="7" w:tplc="042A0003" w:tentative="1">
+      <w:start w:val="1"/>
+      <w:numFmt w:val="bullet"/>
+      <w:lvlText w:val="o"/>
+      <w:lvlJc w:val="left"/>
+      <w:pPr>
+        <w:ind w:left="5760" w:hanging="360"/>
+      </w:pPr>
+      <w:rPr>
+        <w:rFonts w:ascii="Courier New" w:hAnsi="Courier New" w:cs="Courier New" w:hint="default"/>
+      </w:rPr>
+    </w:lvl>
+    <w:lvl w:ilvl="8" w:tplc="042A0005" w:tentative="1">
+      <w:start w:val="1"/>
+      <w:numFmt w:val="bullet"/>
+      <w:lvlText w:val=""/>
+      <w:lvlJc w:val="left"/>
+      <w:pPr>
+        <w:ind w:left="6480" w:hanging="360"/>
+      </w:pPr>
+      <w:rPr>
+        <w:rFonts w:ascii="Wingdings" w:hAnsi="Wingdings" w:hint="default"/>
+      </w:rPr>
+    </w:lvl>
+  </w:abstractNum>
+  <w:abstractNum w:abstractNumId="7" w15:restartNumberingAfterBreak="0">
     <w:nsid w:val="4B247578"/>
     <w:multiLevelType w:val="hybridMultilevel"/>
     <w:tmpl w:val="A7248712"/>
@@ -2886,7 +3095,7 @@
       </w:rPr>
     </w:lvl>
   </w:abstractNum>
-  <w:abstractNum w:abstractNumId="6" w15:restartNumberingAfterBreak="0">
+  <w:abstractNum w:abstractNumId="8" w15:restartNumberingAfterBreak="0">
     <w:nsid w:val="75480BB7"/>
     <w:multiLevelType w:val="hybridMultilevel"/>
     <w:tmpl w:val="5EB013D8"/>
@@ -3000,25 +3209,31 @@
     </w:lvl>
   </w:abstractNum>
   <w:num w:numId="1" w16cid:durableId="987249389">
+    <w:abstractNumId w:val="3"/>
+  </w:num>
+  <w:num w:numId="2" w16cid:durableId="202787559">
+    <w:abstractNumId w:val="4"/>
+  </w:num>
+  <w:num w:numId="3" w16cid:durableId="899363592">
+    <w:abstractNumId w:val="8"/>
+  </w:num>
+  <w:num w:numId="4" w16cid:durableId="2038115980">
     <w:abstractNumId w:val="2"/>
   </w:num>
-  <w:num w:numId="2" w16cid:durableId="202787559">
-    <w:abstractNumId w:val="3"/>
-  </w:num>
-  <w:num w:numId="3" w16cid:durableId="899363592">
-    <w:abstractNumId w:val="6"/>
-  </w:num>
-  <w:num w:numId="4" w16cid:durableId="2038115980">
-    <w:abstractNumId w:val="1"/>
-  </w:num>
   <w:num w:numId="5" w16cid:durableId="919677305">
-    <w:abstractNumId w:val="5"/>
+    <w:abstractNumId w:val="7"/>
   </w:num>
   <w:num w:numId="6" w16cid:durableId="1683048124">
-    <w:abstractNumId w:val="4"/>
+    <w:abstractNumId w:val="5"/>
   </w:num>
   <w:num w:numId="7" w16cid:durableId="322245789">
     <w:abstractNumId w:val="0"/>
+  </w:num>
+  <w:num w:numId="8" w16cid:durableId="1542985222">
+    <w:abstractNumId w:val="1"/>
+  </w:num>
+  <w:num w:numId="9" w16cid:durableId="1436100725">
+    <w:abstractNumId w:val="6"/>
   </w:num>
 </w:numbering>
 </file>
@@ -3423,6 +3638,7 @@
   <w:style w:type="paragraph" w:default="1" w:styleId="Normal">
     <w:name w:val="Normal"/>
     <w:qFormat/>
+    <w:rsid w:val="0061289B"/>
   </w:style>
   <w:style w:type="paragraph" w:styleId="Heading1">
     <w:name w:val="heading 1"/>

</xml_diff>